<commit_message>
chore: repo cleanup and collaboration prep for team sharing
Archive moves: relocated stale root-level files (NFL_Scorecard_Draftv1,
Scorecard_walkaround_proposal, nfl_readme, claude_nfl_tools_plan,
nfl_full-reference, nfl_voice_of_the_fan_research, etc.) to archive/

New files:
- TEAM_GUIDE.md — OneDrive sync + Claude Code setup guide for teammates
- deliverables/nfl-scorecard-dashboard.html — standalone shareable dashboard
- scripts/generate_pptx_nfl.js + package.json — PPTX generation script

Updates:
- working/survey/NFL_Survey_Question_Review.md — backlog updated
- .gitignore — add node_modules/, package-lock.json

Co-Authored-By: Claude Sonnet 4.6 <noreply@anthropic.com>
</commit_message>
<xml_diff>
--- a/deliverables/NFL_Scorecard_Phase 2_Draftv1..1.docx
+++ b/deliverables/NFL_Scorecard_Phase 2_Draftv1..1.docx
@@ -8281,7 +8281,7 @@
         <w:sz w:val="20"/>
         <w:szCs w:val="20"/>
       </w:rPr>
-      <w:t>March 5, 2026</w:t>
+      <w:t>March 25, 2026</w:t>
     </w:r>
     <w:r>
       <w:rPr>
@@ -8332,7 +8332,6 @@
         <w:docPartUnique/>
       </w:docPartObj>
     </w:sdtPr>
-    <w:sdtEndPr/>
     <w:sdtContent>
       <w:p>
         <w:pPr>
@@ -8342,7 +8341,7 @@
           <w:rPr>
             <w:noProof/>
           </w:rPr>
-          <w:pict w14:anchorId="2FC5CA1E">
+          <w:pict w14:anchorId="4966532D">
             <v:shapetype id="_x0000_t136" coordsize="21600,21600" o:spt="136" adj="10800" path="m@7,l@8,m@5,21600l@6,21600e">
               <v:formulas>
                 <v:f eqn="sum #0 0 10800"/>
@@ -21533,6 +21532,25 @@
 </file>
 
 <file path=customXml/item1.xml><?xml version="1.0" encoding="utf-8"?>
+<p:properties xmlns:p="http://schemas.microsoft.com/office/2006/metadata/properties" xmlns:xsi="http://www.w3.org/2001/XMLSchema-instance" xmlns:pc="http://schemas.microsoft.com/office/infopath/2007/PartnerControls">
+  <documentManagement/>
+</p:properties>
+</file>
+
+<file path=customXml/item2.xml><?xml version="1.0" encoding="utf-8"?>
+<b:Sources xmlns:b="http://schemas.openxmlformats.org/officeDocument/2006/bibliography" xmlns="http://schemas.openxmlformats.org/officeDocument/2006/bibliography" SelectedStyle="\APA.XSL" StyleName="APA"/>
+</file>
+
+<file path=customXml/item3.xml><?xml version="1.0" encoding="utf-8"?>
+<?mso-contentType ?>
+<FormTemplates xmlns="http://schemas.microsoft.com/sharepoint/v3/contenttype/forms">
+  <Display>DocumentLibraryForm</Display>
+  <Edit>DocumentLibraryForm</Edit>
+  <New>DocumentLibraryForm</New>
+</FormTemplates>
+</file>
+
+<file path=customXml/item4.xml><?xml version="1.0" encoding="utf-8"?>
 <ct:contentTypeSchema xmlns:ct="http://schemas.microsoft.com/office/2006/metadata/contentType" xmlns:ma="http://schemas.microsoft.com/office/2006/metadata/properties/metaAttributes" ct:_="" ma:_="" ma:contentTypeName="Document" ma:contentTypeID="0x0101003FBFF89390C2E34DA7E01E99E28C597C" ma:contentTypeVersion="3" ma:contentTypeDescription="Create a new document." ma:contentTypeScope="" ma:versionID="52922fe075340f2f9fbe2aa369d5b51b">
   <xsd:schema xmlns:xsd="http://www.w3.org/2001/XMLSchema" xmlns:xs="http://www.w3.org/2001/XMLSchema" xmlns:p="http://schemas.microsoft.com/office/2006/metadata/properties" xmlns:ns2="cf13996c-50cf-456d-9e2e-3913861869a7" targetNamespace="http://schemas.microsoft.com/office/2006/metadata/properties" ma:root="true" ma:fieldsID="dd57a7b92d89349a165dcb64e0dfcf9f" ns2:_="">
     <xsd:import namespace="cf13996c-50cf-456d-9e2e-3913861869a7"/>
@@ -21670,26 +21688,32 @@
 </ct:contentTypeSchema>
 </file>
 
-<file path=customXml/item2.xml><?xml version="1.0" encoding="utf-8"?>
-<p:properties xmlns:p="http://schemas.microsoft.com/office/2006/metadata/properties" xmlns:xsi="http://www.w3.org/2001/XMLSchema-instance" xmlns:pc="http://schemas.microsoft.com/office/infopath/2007/PartnerControls">
-  <documentManagement/>
-</p:properties>
+<file path=customXml/itemProps1.xml><?xml version="1.0" encoding="utf-8"?>
+<ds:datastoreItem xmlns:ds="http://schemas.openxmlformats.org/officeDocument/2006/customXml" ds:itemID="{7513BFAB-6FCA-41E1-B7D1-44333A1A6B70}">
+  <ds:schemaRefs>
+    <ds:schemaRef ds:uri="http://schemas.microsoft.com/office/2006/metadata/properties"/>
+    <ds:schemaRef ds:uri="http://schemas.microsoft.com/office/infopath/2007/PartnerControls"/>
+  </ds:schemaRefs>
+</ds:datastoreItem>
 </file>
 
-<file path=customXml/item3.xml><?xml version="1.0" encoding="utf-8"?>
-<b:Sources xmlns:b="http://schemas.openxmlformats.org/officeDocument/2006/bibliography" xmlns="http://schemas.openxmlformats.org/officeDocument/2006/bibliography" SelectedStyle="\APA.XSL" StyleName="APA"/>
+<file path=customXml/itemProps2.xml><?xml version="1.0" encoding="utf-8"?>
+<ds:datastoreItem xmlns:ds="http://schemas.openxmlformats.org/officeDocument/2006/customXml" ds:itemID="{BED84682-C203-4FE5-A379-8489465621DA}">
+  <ds:schemaRefs>
+    <ds:schemaRef ds:uri="http://schemas.openxmlformats.org/officeDocument/2006/bibliography"/>
+  </ds:schemaRefs>
+</ds:datastoreItem>
 </file>
 
-<file path=customXml/item4.xml><?xml version="1.0" encoding="utf-8"?>
-<?mso-contentType ?>
-<FormTemplates xmlns="http://schemas.microsoft.com/sharepoint/v3/contenttype/forms">
-  <Display>DocumentLibraryForm</Display>
-  <Edit>DocumentLibraryForm</Edit>
-  <New>DocumentLibraryForm</New>
-</FormTemplates>
+<file path=customXml/itemProps3.xml><?xml version="1.0" encoding="utf-8"?>
+<ds:datastoreItem xmlns:ds="http://schemas.openxmlformats.org/officeDocument/2006/customXml" ds:itemID="{73715A0F-3C6F-47F7-B1AB-A74F9BE3E005}">
+  <ds:schemaRefs>
+    <ds:schemaRef ds:uri="http://schemas.microsoft.com/sharepoint/v3/contenttype/forms"/>
+  </ds:schemaRefs>
+</ds:datastoreItem>
 </file>
 
-<file path=customXml/itemProps1.xml><?xml version="1.0" encoding="utf-8"?>
+<file path=customXml/itemProps4.xml><?xml version="1.0" encoding="utf-8"?>
 <ds:datastoreItem xmlns:ds="http://schemas.openxmlformats.org/officeDocument/2006/customXml" ds:itemID="{2886DCB5-C6FA-42DD-8DB7-1D427EFEDFC8}">
   <ds:schemaRefs>
     <ds:schemaRef ds:uri="http://schemas.microsoft.com/office/2006/metadata/contentType"/>
@@ -21707,31 +21731,6 @@
 </ds:datastoreItem>
 </file>
 
-<file path=customXml/itemProps2.xml><?xml version="1.0" encoding="utf-8"?>
-<ds:datastoreItem xmlns:ds="http://schemas.openxmlformats.org/officeDocument/2006/customXml" ds:itemID="{7513BFAB-6FCA-41E1-B7D1-44333A1A6B70}">
-  <ds:schemaRefs>
-    <ds:schemaRef ds:uri="http://schemas.microsoft.com/office/2006/metadata/properties"/>
-    <ds:schemaRef ds:uri="http://schemas.microsoft.com/office/infopath/2007/PartnerControls"/>
-  </ds:schemaRefs>
-</ds:datastoreItem>
-</file>
-
-<file path=customXml/itemProps3.xml><?xml version="1.0" encoding="utf-8"?>
-<ds:datastoreItem xmlns:ds="http://schemas.openxmlformats.org/officeDocument/2006/customXml" ds:itemID="{BED84682-C203-4FE5-A379-8489465621DA}">
-  <ds:schemaRefs>
-    <ds:schemaRef ds:uri="http://schemas.openxmlformats.org/officeDocument/2006/bibliography"/>
-  </ds:schemaRefs>
-</ds:datastoreItem>
-</file>
-
-<file path=customXml/itemProps4.xml><?xml version="1.0" encoding="utf-8"?>
-<ds:datastoreItem xmlns:ds="http://schemas.openxmlformats.org/officeDocument/2006/customXml" ds:itemID="{73715A0F-3C6F-47F7-B1AB-A74F9BE3E005}">
-  <ds:schemaRefs>
-    <ds:schemaRef ds:uri="http://schemas.microsoft.com/sharepoint/v3/contenttype/forms"/>
-  </ds:schemaRefs>
-</ds:datastoreItem>
-</file>
-
 <file path=docMetadata/LabelInfo.xml><?xml version="1.0" encoding="utf-8"?>
 <clbl:labelList xmlns:clbl="http://schemas.microsoft.com/office/2020/mipLabelMetadata">
   <clbl:label id="{e0793d39-0939-496d-b129-198edd916feb}" enabled="0" method="" siteId="{e0793d39-0939-496d-b129-198edd916feb}" removed="1"/>

</xml_diff>